<commit_message>
feat(records): reply, references, inbox done/archive, printed level mark and collapsed preview
- Reply and Create from: new General Book drafts linked to the original
  (live reference, printed المرجع line, level floor). Link existing records,
  Thread section, and an option to also send referenced records.
- Recipients can mark a send done or archive it from their inbox; the sender
  sees done per recipient. Purpose للتوقيع becomes للتعميم; signing stays in
  the approval chain.
- Names on records, send, inbox and bell surfaces follow the screen language.
- Secret and Personal records print سري / شخصي (Calibri 9pt, underlined)
  at the top of every page; changing the level restamps editable copies.
- Records page: preview starts collapsed, double-click opens the record, and
  a row menu offers the record's actions while the preview is closed.

Migrations 0103_recipient_state and 0104_book_links.

(cherry picked from commit ca9d884c7d898a6ff2d88604a10570c539b72095)
</commit_message>
<xml_diff>
--- a/backend/templates/GSSG-GS_300-003_General_Book.docx
+++ b/backend/templates/GSSG-GS_300-003_General_Book.docx
@@ -282,6 +282,87 @@
           <w:lang w:bidi="ar-AE"/>
         </w:rPr>
         <w:t>}</w:t>
+      </w:r>
+    </w:p>
+    <w:p>
+      <w:pPr>
+        <w:pStyle w:val="ListParagraph"/>
+        <w:bidi/>
+        <w:rPr>
+          <w:rFonts w:cstheme="minorHAnsi"/>
+          <w:b/>
+          <w:bCs/>
+          <w:sz w:val="28"/>
+          <w:szCs w:val="28"/>
+          <w:rtl/>
+          <w:lang w:bidi="ar-AE"/>
+        </w:rPr>
+      </w:pPr>
+      <w:r>
+        <w:rPr>
+          <w:rFonts w:cstheme="minorHAnsi" w:hint="cs"/>
+          <w:b/>
+          <w:bCs/>
+          <w:sz w:val="28"/>
+          <w:szCs w:val="28"/>
+          <w:rtl/>
+          <w:lang w:bidi="ar-AE"/>
+        </w:rPr>
+        <w:t>{%p if reference_line %}</w:t>
+      </w:r>
+    </w:p>
+    <w:p>
+      <w:pPr>
+        <w:pStyle w:val="ListParagraph"/>
+        <w:bidi/>
+        <w:rPr>
+          <w:rFonts w:cstheme="minorHAnsi"/>
+          <w:b/>
+          <w:bCs/>
+          <w:sz w:val="28"/>
+          <w:szCs w:val="28"/>
+          <w:rtl/>
+          <w:lang w:bidi="ar-AE"/>
+        </w:rPr>
+      </w:pPr>
+      <w:r>
+        <w:rPr>
+          <w:rFonts w:cstheme="minorHAnsi" w:hint="cs"/>
+          <w:b/>
+          <w:bCs/>
+          <w:sz w:val="28"/>
+          <w:szCs w:val="28"/>
+          <w:rtl/>
+          <w:lang w:bidi="ar-AE"/>
+        </w:rPr>
+        <w:t>{{ reference_line }}</w:t>
+      </w:r>
+    </w:p>
+    <w:p>
+      <w:pPr>
+        <w:pStyle w:val="ListParagraph"/>
+        <w:bidi/>
+        <w:rPr>
+          <w:rFonts w:cstheme="minorHAnsi"/>
+          <w:b/>
+          <w:bCs/>
+          <w:sz w:val="28"/>
+          <w:szCs w:val="28"/>
+          <w:rtl/>
+          <w:lang w:bidi="ar-AE"/>
+        </w:rPr>
+      </w:pPr>
+      <w:r>
+        <w:rPr>
+          <w:rFonts w:cstheme="minorHAnsi" w:hint="cs"/>
+          <w:b/>
+          <w:bCs/>
+          <w:sz w:val="28"/>
+          <w:szCs w:val="28"/>
+          <w:rtl/>
+          <w:lang w:bidi="ar-AE"/>
+        </w:rPr>
+        <w:t>{%p endif %}</w:t>
       </w:r>
     </w:p>
     <w:p>

</xml_diff>

<commit_message>
fix(books): General Book footer prints the submitter G-number on every page, like the Report
- Template: G-number cell (Report style) in both the first-page and default
  footers; drop the hidden WordArt G watermarks so it never prints twice.
- _adapt_general_book stops blanking submitter_g (also fixes Security Permit,
  which shares the adapter); signed re-renders use the book submitter's G.
- Saved templates: retokenize keeps/inserts the footer cell; startup adds it to
  library templates saved while the paper printed none (idempotent).
- Footer-cell helper moved from apply_report_letterhead.py into app core.

(cherry picked from commit a24b9eab135ea69aaf6dd1eee863a3690a440314)
</commit_message>
<xml_diff>
--- a/backend/templates/GSSG-GS_300-003_General_Book.docx
+++ b/backend/templates/GSSG-GS_300-003_General_Book.docx
@@ -787,7 +787,7 @@
   <w:tbl>
     <w:tblPr>
       <w:tblStyle w:val="TableGrid"/>
-      <w:tblW w:w="10084" w:type="dxa"/>
+      <w:tblW w:w="9990" w:type="dxa"/>
       <w:tblInd w:w="360" w:type="dxa"/>
       <w:tblBorders>
         <w:top w:val="none" w:sz="0" w:space="0" w:color="auto"/>
@@ -802,7 +802,8 @@
     <w:tblGrid>
       <w:gridCol w:w="3361"/>
       <w:gridCol w:w="3361"/>
-      <w:gridCol w:w="3362"/>
+      <w:gridCol w:w="2368"/>
+      <w:gridCol w:w="900"/>
     </w:tblGrid>
     <w:tr>
       <w:trPr>
@@ -1295,7 +1296,7 @@
       </w:tc>
       <w:tc>
         <w:tcPr>
-          <w:tcW w:w="3362" w:type="dxa"/>
+          <w:tcW w:w="2368" w:type="dxa"/>
           <w:vAlign w:val="center"/>
         </w:tcPr>
         <w:p>
@@ -1680,6 +1681,29 @@
           </w:r>
         </w:p>
       </w:tc>
+      <w:tc>
+        <w:tcPr>
+          <w:tcW w:w="900" w:type="dxa"/>
+          <w:vAlign w:val="top"/>
+        </w:tcPr>
+        <w:p>
+          <w:pPr>
+            <w:pStyle w:val="Footer"/>
+            <w:bidi w:val="0"/>
+            <w:spacing w:before="80" w:after="0"/>
+            <w:jc w:val="right"/>
+          </w:pPr>
+          <w:r>
+            <w:rPr>
+              <w:rFonts w:ascii="Helvetica" w:hAnsi="Helvetica"/>
+              <w:color w:val="A09F9F"/>
+              <w:sz w:val="16"/>
+              <w:szCs w:val="16"/>
+            </w:rPr>
+            <w:t>{{ submitter_g }}</w:t>
+          </w:r>
+        </w:p>
+      </w:tc>
     </w:tr>
     <w:bookmarkEnd w:id="0"/>
   </w:tbl>
@@ -1823,46 +1847,11 @@
         <w:tab w:val="left" w:pos="8280"/>
       </w:tabs>
     </w:pPr>
-    <w:r>
-      <w:rPr>
-        <w:noProof/>
-      </w:rPr>
-      <w:pict w14:anchorId="22899DFB">
-        <v:shapetype id="_x0000_t136" coordsize="21600,21600" o:spt="136" adj="10800" path="m@7,l@8,m@5,21600l@6,21600e">
-          <v:formulas>
-            <v:f eqn="sum #0 0 10800"/>
-            <v:f eqn="prod #0 2 1"/>
-            <v:f eqn="sum 21600 0 @1"/>
-            <v:f eqn="sum 0 0 @2"/>
-            <v:f eqn="sum 21600 0 @3"/>
-            <v:f eqn="if @0 @3 0"/>
-            <v:f eqn="if @0 21600 @1"/>
-            <v:f eqn="if @0 0 @2"/>
-            <v:f eqn="if @0 @4 21600"/>
-            <v:f eqn="mid @5 @6"/>
-            <v:f eqn="mid @8 @5"/>
-            <v:f eqn="mid @7 @8"/>
-            <v:f eqn="mid @6 @7"/>
-            <v:f eqn="sum @6 0 @5"/>
-          </v:formulas>
-          <v:path textpathok="t" o:connecttype="custom" o:connectlocs="@9,0;@10,10800;@11,21600;@12,10800" o:connectangles="270,180,90,0"/>
-          <v:textpath on="t" fitshape="t"/>
-          <v:handles>
-            <v:h position="#0,bottomRight" xrange="6629,14971"/>
-          </v:handles>
-          <o:lock v:ext="edit" text="t" shapetype="t"/>
-        </v:shapetype>
-        <v:shape id="PowerPlusWaterMarkObject462468437" o:spid="_x0000_s1026" type="#_x0000_t136" style="position:absolute;margin-left:212.95pt;margin-top:671.95pt;width:85.8pt;height:14.4pt;z-index:-251569152;mso-position-horizontal-relative:margin;mso-position-vertical-relative:margin" o:allowincell="f" fillcolor="silver" stroked="f">
-          <v:textpath style="font-family:&quot;Calibri&quot;;font-size:12pt" string="{{ submitter_g }}"/>
-          <w10:wrap anchorx="margin" anchory="margin"/>
-        </v:shape>
-      </w:pict>
-    </w:r>
   </w:p>
   <w:tbl>
     <w:tblPr>
       <w:tblStyle w:val="TableGrid"/>
-      <w:tblW w:w="10084" w:type="dxa"/>
+      <w:tblW w:w="9990" w:type="dxa"/>
       <w:tblInd w:w="360" w:type="dxa"/>
       <w:tblBorders>
         <w:top w:val="none" w:sz="0" w:space="0" w:color="auto"/>
@@ -1877,7 +1866,8 @@
     <w:tblGrid>
       <w:gridCol w:w="3361"/>
       <w:gridCol w:w="3361"/>
-      <w:gridCol w:w="3362"/>
+      <w:gridCol w:w="2368"/>
+      <w:gridCol w:w="900"/>
     </w:tblGrid>
     <w:tr>
       <w:trPr>
@@ -2369,7 +2359,7 @@
       </w:tc>
       <w:tc>
         <w:tcPr>
-          <w:tcW w:w="3362" w:type="dxa"/>
+          <w:tcW w:w="2368" w:type="dxa"/>
           <w:vAlign w:val="center"/>
         </w:tcPr>
         <w:p>
@@ -2754,6 +2744,29 @@
           </w:r>
         </w:p>
       </w:tc>
+      <w:tc>
+        <w:tcPr>
+          <w:tcW w:w="900" w:type="dxa"/>
+          <w:vAlign w:val="top"/>
+        </w:tcPr>
+        <w:p>
+          <w:pPr>
+            <w:pStyle w:val="Footer"/>
+            <w:bidi w:val="0"/>
+            <w:spacing w:before="80" w:after="0"/>
+            <w:jc w:val="right"/>
+          </w:pPr>
+          <w:r>
+            <w:rPr>
+              <w:rFonts w:ascii="Helvetica" w:hAnsi="Helvetica"/>
+              <w:color w:val="A09F9F"/>
+              <w:sz w:val="16"/>
+              <w:szCs w:val="16"/>
+            </w:rPr>
+            <w:t>{{ submitter_g }}</w:t>
+          </w:r>
+        </w:p>
+      </w:tc>
     </w:tr>
   </w:tbl>
   <w:p>
@@ -2794,41 +2807,6 @@
     <w:pPr>
       <w:pStyle w:val="Header"/>
     </w:pPr>
-    <w:r>
-      <w:rPr>
-        <w:noProof/>
-      </w:rPr>
-      <w:pict w14:anchorId="6A474621">
-        <v:shapetype id="_x0000_t136" coordsize="21600,21600" o:spt="136" adj="10800" path="m@7,l@8,m@5,21600l@6,21600e">
-          <v:formulas>
-            <v:f eqn="sum #0 0 10800"/>
-            <v:f eqn="prod #0 2 1"/>
-            <v:f eqn="sum 21600 0 @1"/>
-            <v:f eqn="sum 0 0 @2"/>
-            <v:f eqn="sum 21600 0 @3"/>
-            <v:f eqn="if @0 @3 0"/>
-            <v:f eqn="if @0 21600 @1"/>
-            <v:f eqn="if @0 0 @2"/>
-            <v:f eqn="if @0 @4 21600"/>
-            <v:f eqn="mid @5 @6"/>
-            <v:f eqn="mid @8 @5"/>
-            <v:f eqn="mid @7 @8"/>
-            <v:f eqn="mid @6 @7"/>
-            <v:f eqn="sum @6 0 @5"/>
-          </v:formulas>
-          <v:path textpathok="t" o:connecttype="custom" o:connectlocs="@9,0;@10,10800;@11,21600;@12,10800" o:connectangles="270,180,90,0"/>
-          <v:textpath on="t" fitshape="t"/>
-          <v:handles>
-            <v:h position="#0,bottomRight" xrange="6629,14971"/>
-          </v:handles>
-          <o:lock v:ext="edit" text="t" shapetype="t"/>
-        </v:shapetype>
-        <v:shape id="PowerPlusWaterMarkObject462468438" o:spid="_x0000_s1027" type="#_x0000_t136" style="position:absolute;margin-left:0;margin-top:0;width:31.8pt;height:14.4pt;z-index:-251567104;mso-position-horizontal:center;mso-position-horizontal-relative:margin;mso-position-vertical:center;mso-position-vertical-relative:margin" o:allowincell="f" fillcolor="silver" stroked="f">
-          <v:textpath style="font-family:&quot;Calibri&quot;;font-size:12pt" string="{{ submitter_g }}"/>
-          <w10:wrap anchorx="margin" anchory="margin"/>
-        </v:shape>
-      </w:pict>
-    </w:r>
   </w:p>
 </w:hdr>
 </file>
@@ -2840,41 +2818,6 @@
       <w:pStyle w:val="Header"/>
       <w:ind w:left="360"/>
     </w:pPr>
-    <w:r>
-      <w:rPr>
-        <w:noProof/>
-      </w:rPr>
-      <w:pict w14:anchorId="4B5A4B23">
-        <v:shapetype id="_x0000_t136" coordsize="21600,21600" o:spt="136" adj="10800" path="m@7,l@8,m@5,21600l@6,21600e">
-          <v:formulas>
-            <v:f eqn="sum #0 0 10800"/>
-            <v:f eqn="prod #0 2 1"/>
-            <v:f eqn="sum 21600 0 @1"/>
-            <v:f eqn="sum 0 0 @2"/>
-            <v:f eqn="sum 21600 0 @3"/>
-            <v:f eqn="if @0 @3 0"/>
-            <v:f eqn="if @0 21600 @1"/>
-            <v:f eqn="if @0 0 @2"/>
-            <v:f eqn="if @0 @4 21600"/>
-            <v:f eqn="mid @5 @6"/>
-            <v:f eqn="mid @8 @5"/>
-            <v:f eqn="mid @7 @8"/>
-            <v:f eqn="mid @6 @7"/>
-            <v:f eqn="sum @6 0 @5"/>
-          </v:formulas>
-          <v:path textpathok="t" o:connecttype="custom" o:connectlocs="@9,0;@10,10800;@11,21600;@12,10800" o:connectangles="270,180,90,0"/>
-          <v:textpath on="t" fitshape="t"/>
-          <v:handles>
-            <v:h position="#0,bottomRight" xrange="6629,14971"/>
-          </v:handles>
-          <o:lock v:ext="edit" text="t" shapetype="t"/>
-        </v:shapetype>
-        <v:shape id="PowerPlusWaterMarkObject462468439" o:spid="_x0000_s1028" type="#_x0000_t136" style="position:absolute;left:0;text-align:left;margin-left:0;margin-top:0;width:31.8pt;height:14.4pt;z-index:-251565056;mso-position-horizontal:center;mso-position-horizontal-relative:margin;mso-position-vertical:center;mso-position-vertical-relative:margin" o:allowincell="f" fillcolor="silver" stroked="f">
-          <v:textpath style="font-family:&quot;Calibri&quot;;font-size:12pt" string="{{ submitter_g }}"/>
-          <w10:wrap anchorx="margin" anchory="margin"/>
-        </v:shape>
-      </w:pict>
-    </w:r>
   </w:p>
   <w:p>
     <w:pPr>

</xml_diff>